<commit_message>
Add placeholder components and initial documentation
- Created placeholder components in the following directories: components, pages, services, stores, and styles.
- Added a day1.md file in the temp directory outlining tasks assigned to team members.
- Introduced a new document for product documentation.
</commit_message>
<xml_diff>
--- a/AI Imposter Product Documentation.docx
+++ b/AI Imposter Product Documentation.docx
@@ -101,7 +101,24 @@
       <w:pPr>
         <w:jc w:val="center"/>
         <w:rPr>
-          <w:rFonts w:hint="cs"/>
+          <w:sz w:val="32"/>
+          <w:szCs w:val="32"/>
+          <w:lang w:val="en-US"/>
+        </w:rPr>
+      </w:pPr>
+      <w:r>
+        <w:rPr>
+          <w:sz w:val="32"/>
+          <w:szCs w:val="32"/>
+          <w:lang w:val="en-US"/>
+        </w:rPr>
+        <w:t>Daniel Chernov</w:t>
+      </w:r>
+    </w:p>
+    <w:p>
+      <w:pPr>
+        <w:jc w:val="center"/>
+        <w:rPr>
           <w:sz w:val="32"/>
           <w:szCs w:val="32"/>
           <w:rtl/>
@@ -114,7 +131,15 @@
           <w:szCs w:val="32"/>
           <w:lang w:val="en-US"/>
         </w:rPr>
-        <w:t>Daniel Chernov</w:t>
+        <w:t>Yosef P</w:t>
+      </w:r>
+      <w:r>
+        <w:rPr>
+          <w:sz w:val="32"/>
+          <w:szCs w:val="32"/>
+          <w:lang w:val="en-US"/>
+        </w:rPr>
+        <w:t>erelman</w:t>
       </w:r>
     </w:p>
     <w:p>
@@ -238,7 +263,6 @@
           <w:szCs w:val="32"/>
           <w:u w:val="single"/>
         </w:rPr>
-        <w:lastRenderedPageBreak/>
         <w:t>Description</w:t>
       </w:r>
     </w:p>
@@ -827,6 +851,7 @@
           <w:sz w:val="24"/>
           <w:szCs w:val="24"/>
         </w:rPr>
+        <w:lastRenderedPageBreak/>
         <w:t>See the updated leaderboard.</w:t>
       </w:r>
     </w:p>
@@ -884,7 +909,6 @@
           <w:sz w:val="24"/>
           <w:szCs w:val="24"/>
         </w:rPr>
-        <w:lastRenderedPageBreak/>
         <w:t>Click Play Again.</w:t>
       </w:r>
     </w:p>
@@ -1989,21 +2013,7 @@
           <w:sz w:val="28"/>
           <w:szCs w:val="28"/>
         </w:rPr>
-        <w:t xml:space="preserve">This flow repeats for 5 rounds, and then the </w:t>
-      </w:r>
-      <w:r>
-        <w:rPr>
-          <w:sz w:val="28"/>
-          <w:szCs w:val="28"/>
-        </w:rPr>
-        <w:t>results</w:t>
-      </w:r>
-      <w:r>
-        <w:rPr>
-          <w:sz w:val="28"/>
-          <w:szCs w:val="28"/>
-        </w:rPr>
-        <w:t xml:space="preserve"> screen shows the podium, with options to Play Again or Quit.</w:t>
+        <w:t>This flow repeats for 5 rounds, and then the results screen shows the podium, with options to Play Again or Quit.</w:t>
       </w:r>
     </w:p>
     <w:p>
@@ -2232,7 +2242,6 @@
           <w:szCs w:val="28"/>
         </w:rPr>
       </w:pPr>
-      <w:proofErr w:type="spellStart"/>
       <w:r>
         <w:rPr>
           <w:sz w:val="28"/>
@@ -2241,7 +2250,6 @@
         </w:rPr>
         <w:t>game_id</w:t>
       </w:r>
-      <w:proofErr w:type="spellEnd"/>
     </w:p>
     <w:p>
       <w:pPr>
@@ -2478,7 +2486,6 @@
           <w:lang w:val="en-US"/>
         </w:rPr>
       </w:pPr>
-      <w:proofErr w:type="spellStart"/>
       <w:r>
         <w:rPr>
           <w:sz w:val="28"/>
@@ -2487,7 +2494,6 @@
         </w:rPr>
         <w:t>round_number</w:t>
       </w:r>
-      <w:proofErr w:type="spellEnd"/>
     </w:p>
     <w:p>
       <w:pPr>
@@ -2502,7 +2508,6 @@
           <w:lang w:val="en-US"/>
         </w:rPr>
       </w:pPr>
-      <w:proofErr w:type="spellStart"/>
       <w:r>
         <w:rPr>
           <w:sz w:val="28"/>
@@ -2511,7 +2516,6 @@
         </w:rPr>
         <w:t>question_id</w:t>
       </w:r>
-      <w:proofErr w:type="spellEnd"/>
     </w:p>
     <w:p>
       <w:pPr>
@@ -2526,7 +2530,6 @@
           <w:lang w:val="en-US"/>
         </w:rPr>
       </w:pPr>
-      <w:proofErr w:type="spellStart"/>
       <w:r>
         <w:rPr>
           <w:sz w:val="28"/>
@@ -2535,7 +2538,6 @@
         </w:rPr>
         <w:t>player_id</w:t>
       </w:r>
-      <w:proofErr w:type="spellEnd"/>
     </w:p>
     <w:p>
       <w:pPr>
@@ -2572,7 +2574,6 @@
           <w:lang w:val="en-US"/>
         </w:rPr>
       </w:pPr>
-      <w:proofErr w:type="spellStart"/>
       <w:r>
         <w:rPr>
           <w:sz w:val="28"/>
@@ -2581,7 +2582,6 @@
         </w:rPr>
         <w:t>is_valid</w:t>
       </w:r>
-      <w:proofErr w:type="spellEnd"/>
     </w:p>
     <w:p>
       <w:pPr>
@@ -2694,7 +2694,6 @@
           <w:lang w:val="en-US"/>
         </w:rPr>
       </w:pPr>
-      <w:proofErr w:type="spellStart"/>
       <w:r>
         <w:rPr>
           <w:sz w:val="28"/>
@@ -2703,7 +2702,6 @@
         </w:rPr>
         <w:t>round_number</w:t>
       </w:r>
-      <w:proofErr w:type="spellEnd"/>
     </w:p>
     <w:p>
       <w:pPr>
@@ -2718,7 +2716,6 @@
           <w:lang w:val="en-US"/>
         </w:rPr>
       </w:pPr>
-      <w:proofErr w:type="spellStart"/>
       <w:r>
         <w:rPr>
           <w:sz w:val="28"/>
@@ -2727,7 +2724,6 @@
         </w:rPr>
         <w:t>voter_player_id</w:t>
       </w:r>
-      <w:proofErr w:type="spellEnd"/>
     </w:p>
     <w:p>
       <w:pPr>
@@ -2742,7 +2738,6 @@
           <w:lang w:val="en-US"/>
         </w:rPr>
       </w:pPr>
-      <w:proofErr w:type="spellStart"/>
       <w:r>
         <w:rPr>
           <w:sz w:val="28"/>
@@ -2751,7 +2746,6 @@
         </w:rPr>
         <w:t>answer_id</w:t>
       </w:r>
-      <w:proofErr w:type="spellEnd"/>
     </w:p>
     <w:p>
       <w:pPr>
@@ -2898,7 +2892,6 @@
           <w:lang w:val="en-US"/>
         </w:rPr>
       </w:pPr>
-      <w:proofErr w:type="spellStart"/>
       <w:r>
         <w:rPr>
           <w:b/>
@@ -2909,7 +2902,6 @@
         </w:rPr>
         <w:t>current_round</w:t>
       </w:r>
-      <w:proofErr w:type="spellEnd"/>
     </w:p>
     <w:p>
       <w:pPr>
@@ -3646,7 +3638,6 @@
     <w:p>
       <w:pPr>
         <w:rPr>
-          <w:rFonts w:hint="cs"/>
           <w:sz w:val="28"/>
           <w:szCs w:val="28"/>
           <w:rtl/>
@@ -5714,6 +5705,7 @@
   <w:style w:type="character" w:default="1" w:styleId="DefaultParagraphFont">
     <w:name w:val="Default Paragraph Font"/>
     <w:uiPriority w:val="1"/>
+    <w:semiHidden/>
     <w:unhideWhenUsed/>
   </w:style>
   <w:style w:type="table" w:default="1" w:styleId="TableNormal">

</xml_diff>